<commit_message>
feat: Update sf-develop skill references and enhance documentation across multiple files
</commit_message>
<xml_diff>
--- a/reference/salesforce-consulting-framework.docx
+++ b/reference/salesforce-consulting-framework.docx
@@ -3005,7 +3005,7 @@
                 <w:sz w:val="20"/>
                 <w:szCs w:val="20"/>
               </w:rPr>
-              <w:t xml:space="preserve">Joining an existing project where discovery is complete. Requirements are documented and the team needs development capacity.</w:t>
+              <w:t xml:space="preserve">Joining an existing project where discovery is complete. Requirements are documented and the team needs development capacity. The sf-develop skill serves as the primary build tool, receiving approved solution plans from sf-architect-solutioning and generating SFDX metadata, Apex, LWC components, and tests.</w:t>
             </w:r>
           </w:p>
         </w:tc>
@@ -4874,6 +4874,110 @@
                 <w:sz w:val="20"/>
                 <w:szCs w:val="20"/>
               </w:rPr>
+              <w:t xml:space="preserve">sf-develop</w:t>
+            </w:r>
+          </w:p>
+        </w:tc>
+        <w:tc>
+          <w:tcPr>
+            <w:tcW w:type="dxa" w:w="5560"/>
+            <w:tcBorders>
+              <w:top w:val="single" w:color="D1D5DB" w:sz="1"/>
+              <w:left w:val="single" w:color="D1D5DB" w:sz="1"/>
+              <w:bottom w:val="single" w:color="D1D5DB" w:sz="1"/>
+              <w:right w:val="single" w:color="D1D5DB" w:sz="1"/>
+            </w:tcBorders>
+            <w:shd w:fill="FFFFFF" w:val="clear"/>
+            <w:tcMar>
+              <w:top w:type="dxa" w:w="80"/>
+              <w:left w:type="dxa" w:w="120"/>
+              <w:bottom w:type="dxa" w:w="80"/>
+              <w:right w:type="dxa" w:w="120"/>
+            </w:tcMar>
+          </w:tcPr>
+          <w:p>
+            <w:pPr>
+              <w:jc w:val="left"/>
+            </w:pPr>
+            <w:r>
+              <w:rPr>
+                <w:rFonts w:ascii="Calibri" w:cs="Calibri" w:eastAsia="Calibri" w:hAnsi="Calibri"/>
+                <w:b w:val="false"/>
+                <w:bCs w:val="false"/>
+                <w:color w:val="000000"/>
+                <w:sz w:val="20"/>
+                <w:szCs w:val="20"/>
+              </w:rPr>
+              <w:t xml:space="preserve">Primary Build-phase skill: implements approved solution plans by generating SFDX metadata XML, Apex classes, LWC components, tests, and keeping living docs in sync.</w:t>
+            </w:r>
+          </w:p>
+        </w:tc>
+      </w:tr>
+      <w:tr>
+        <w:tc>
+          <w:tcPr>
+            <w:tcW w:type="dxa" w:w="1600"/>
+            <w:tcBorders>
+              <w:top w:val="single" w:color="D1D5DB" w:sz="1"/>
+              <w:left w:val="single" w:color="D1D5DB" w:sz="1"/>
+              <w:bottom w:val="single" w:color="D1D5DB" w:sz="1"/>
+              <w:right w:val="single" w:color="D1D5DB" w:sz="1"/>
+            </w:tcBorders>
+            <w:shd w:fill="F3F4F6" w:val="clear"/>
+            <w:tcMar>
+              <w:top w:type="dxa" w:w="80"/>
+              <w:left w:type="dxa" w:w="120"/>
+              <w:bottom w:type="dxa" w:w="80"/>
+              <w:right w:type="dxa" w:w="120"/>
+            </w:tcMar>
+          </w:tcPr>
+          <w:p>
+            <w:pPr>
+              <w:jc w:val="left"/>
+            </w:pPr>
+            <w:r>
+              <w:rPr>
+                <w:rFonts w:ascii="Calibri" w:cs="Calibri" w:eastAsia="Calibri" w:hAnsi="Calibri"/>
+                <w:b w:val="false"/>
+                <w:bCs w:val="false"/>
+                <w:color w:val="000000"/>
+                <w:sz w:val="20"/>
+                <w:szCs w:val="20"/>
+              </w:rPr>
+              <w:t xml:space="preserve">Skills</w:t>
+            </w:r>
+          </w:p>
+        </w:tc>
+        <w:tc>
+          <w:tcPr>
+            <w:tcW w:type="dxa" w:w="2200"/>
+            <w:tcBorders>
+              <w:top w:val="single" w:color="D1D5DB" w:sz="1"/>
+              <w:left w:val="single" w:color="D1D5DB" w:sz="1"/>
+              <w:bottom w:val="single" w:color="D1D5DB" w:sz="1"/>
+              <w:right w:val="single" w:color="D1D5DB" w:sz="1"/>
+            </w:tcBorders>
+            <w:shd w:fill="F3F4F6" w:val="clear"/>
+            <w:tcMar>
+              <w:top w:type="dxa" w:w="80"/>
+              <w:left w:type="dxa" w:w="120"/>
+              <w:bottom w:type="dxa" w:w="80"/>
+              <w:right w:type="dxa" w:w="120"/>
+            </w:tcMar>
+          </w:tcPr>
+          <w:p>
+            <w:pPr>
+              <w:jc w:val="left"/>
+            </w:pPr>
+            <w:r>
+              <w:rPr>
+                <w:rFonts w:ascii="Calibri" w:cs="Calibri" w:eastAsia="Calibri" w:hAnsi="Calibri"/>
+                <w:b w:val="false"/>
+                <w:bCs w:val="false"/>
+                <w:color w:val="000000"/>
+                <w:sz w:val="20"/>
+                <w:szCs w:val="20"/>
+              </w:rPr>
               <w:t xml:space="preserve">docx / pptx</w:t>
             </w:r>
           </w:p>
@@ -4887,7 +4991,7 @@
               <w:bottom w:val="single" w:color="D1D5DB" w:sz="1"/>
               <w:right w:val="single" w:color="D1D5DB" w:sz="1"/>
             </w:tcBorders>
-            <w:shd w:fill="FFFFFF" w:val="clear"/>
+            <w:shd w:fill="F3F4F6" w:val="clear"/>
             <w:tcMar>
               <w:top w:type="dxa" w:w="80"/>
               <w:left w:type="dxa" w:w="120"/>
@@ -10907,7 +11011,7 @@
                 <w:sz w:val="20"/>
                 <w:szCs w:val="20"/>
               </w:rPr>
-              <w:t xml:space="preserve">Codebase Assessment, Tech Debt Remediation, Feature Development Sprints, Integration Testing, Deployment &amp; Stabilization</w:t>
+              <w:t xml:space="preserve">Codebase Assessment, Tech Debt Remediation, Feature Development Sprints (driven by sf-develop), Integration Testing, Deployment &amp; Stabilization</w:t>
             </w:r>
           </w:p>
         </w:tc>

</xml_diff>